<commit_message>
MEJORAS SEO Y GEO
</commit_message>
<xml_diff>
--- a/ABRIR IA.docx
+++ b/ABRIR IA.docx
@@ -3,240 +3,478 @@
 <w:document xmlns:wpc="http://schemas.microsoft.com/office/word/2010/wordprocessingCanvas" xmlns:cx="http://schemas.microsoft.com/office/drawing/2014/chartex" xmlns:cx1="http://schemas.microsoft.com/office/drawing/2015/9/8/chartex" xmlns:cx2="http://schemas.microsoft.com/office/drawing/2015/10/21/chartex" xmlns:cx3="http://schemas.microsoft.com/office/drawing/2016/5/9/chartex" xmlns:cx4="http://schemas.microsoft.com/office/drawing/2016/5/10/chartex" xmlns:cx5="http://schemas.microsoft.com/office/drawing/2016/5/11/chartex" xmlns:cx6="http://schemas.microsoft.com/office/drawing/2016/5/12/chartex" xmlns:cx7="http://schemas.microsoft.com/office/drawing/2016/5/13/chartex" xmlns:cx8="http://schemas.microsoft.com/office/drawing/2016/5/14/chartex" xmlns:mc="http://schemas.openxmlformats.org/markup-compatibility/2006" xmlns:aink="http://schemas.microsoft.com/office/drawing/2016/ink" xmlns:am3d="http://schemas.microsoft.com/office/drawing/2017/model3d" xmlns:o="urn:schemas-microsoft-com:office:office" xmlns:r="http://schemas.openxmlformats.org/officeDocument/2006/relationships" xmlns:m="http://schemas.openxmlformats.org/officeDocument/2006/math" xmlns:v="urn:schemas-microsoft-com:vml" xmlns:wp14="http://schemas.microsoft.com/office/word/2010/wordprocessingDrawing" xmlns:wp="http://schemas.openxmlformats.org/drawingml/2006/wordprocessingDrawing" xmlns:w10="urn:schemas-microsoft-com:office:word" xmlns:w="http://schemas.openxmlformats.org/wordprocessingml/2006/main" xmlns:w14="http://schemas.microsoft.com/office/word/2010/wordml" xmlns:w15="http://schemas.microsoft.com/office/word/2012/wordml" xmlns:w16cid="http://schemas.microsoft.com/office/word/2016/wordml/cid" xmlns:w16se="http://schemas.microsoft.com/office/word/2015/wordml/symex" xmlns:wpg="http://schemas.microsoft.com/office/word/2010/wordprocessingGroup" xmlns:wpi="http://schemas.microsoft.com/office/word/2010/wordprocessingInk" xmlns:wne="http://schemas.microsoft.com/office/word/2006/wordml" xmlns:wps="http://schemas.microsoft.com/office/word/2010/wordprocessingShape" mc:Ignorable="w14 w15 w16se w16cid wp14">
   <w:body>
     <w:p>
+      <w:pPr>
+        <w:rPr>
+          <w:noProof/>
+        </w:rPr>
+      </w:pPr>
+      <w:r>
+        <w:rPr>
+          <w:noProof/>
+        </w:rPr>
+        <w:t>DOCKER:</w:t>
+      </w:r>
+    </w:p>
+    <w:p>
+      <w:pPr>
+        <w:rPr>
+          <w:noProof/>
+        </w:rPr>
+      </w:pPr>
+    </w:p>
+    <w:p>
+      <w:pPr>
+        <w:rPr>
+          <w:noProof/>
+        </w:rPr>
+      </w:pPr>
+      <w:r>
+        <w:rPr>
+          <w:noProof/>
+        </w:rPr>
+        <w:t>Tener abierto Docker desktop</w:t>
+      </w:r>
+    </w:p>
+    <w:p>
+      <w:pPr>
+        <w:rPr>
+          <w:noProof/>
+        </w:rPr>
+      </w:pPr>
+      <w:r>
+        <w:rPr>
+          <w:noProof/>
+        </w:rPr>
+        <w:t>En la consola de Power Shell:</w:t>
+      </w:r>
+    </w:p>
+    <w:p>
+      <w:pPr>
+        <w:rPr>
+          <w:noProof/>
+        </w:rPr>
+      </w:pPr>
+      <w:r>
+        <w:rPr>
+          <w:noProof/>
+        </w:rPr>
+        <w:tab/>
+      </w:r>
+      <w:r>
+        <w:rPr>
+          <w:noProof/>
+        </w:rPr>
+        <w:tab/>
+      </w:r>
+      <w:r>
+        <w:rPr>
+          <w:noProof/>
+        </w:rPr>
+        <w:tab/>
+      </w:r>
+      <w:r>
+        <w:rPr>
+          <w:noProof/>
+        </w:rPr>
+        <w:tab/>
+        <w:t>Docker ai</w:t>
+      </w:r>
+    </w:p>
+    <w:p>
+      <w:pPr>
+        <w:rPr>
+          <w:noProof/>
+        </w:rPr>
+      </w:pPr>
+    </w:p>
+    <w:p>
+      <w:pPr>
+        <w:rPr>
+          <w:noProof/>
+        </w:rPr>
+      </w:pPr>
+      <w:r>
+        <w:rPr>
+          <w:noProof/>
+        </w:rPr>
+        <w:t>ANTIGRAVITY:</w:t>
+      </w:r>
+    </w:p>
+    <w:p>
+      <w:pPr>
+        <w:rPr>
+          <w:noProof/>
+        </w:rPr>
+      </w:pPr>
+      <w:r>
+        <w:rPr>
+          <w:noProof/>
+        </w:rPr>
+        <w:t>En la consola de Power Shell:</w:t>
+      </w:r>
+    </w:p>
+    <w:p>
+      <w:pPr>
+        <w:rPr>
+          <w:noProof/>
+          <w:color w:val="FF0000"/>
+          <w:sz w:val="14"/>
+        </w:rPr>
+      </w:pPr>
+      <w:r>
+        <w:rPr>
+          <w:noProof/>
+        </w:rPr>
+        <w:tab/>
+      </w:r>
+      <w:r>
+        <w:rPr>
+          <w:noProof/>
+        </w:rPr>
+        <w:tab/>
+      </w:r>
+      <w:r>
+        <w:rPr>
+          <w:noProof/>
+        </w:rPr>
+        <w:tab/>
+      </w:r>
+      <w:r>
+        <w:rPr>
+          <w:noProof/>
+        </w:rPr>
+        <w:tab/>
+      </w:r>
+      <w:r>
+        <w:rPr>
+          <w:noProof/>
+        </w:rPr>
+        <w:t>agy --continue --dangerously-skip-permissions</w:t>
+      </w:r>
+      <w:r>
+        <w:rPr>
+          <w:noProof/>
+        </w:rPr>
+        <w:t xml:space="preserve"> </w:t>
+      </w:r>
+      <w:r>
+        <w:rPr>
+          <w:noProof/>
+          <w:color w:val="FF0000"/>
+        </w:rPr>
+        <w:t>**</w:t>
+      </w:r>
+      <w:r>
+        <w:rPr>
+          <w:noProof/>
+          <w:color w:val="FF0000"/>
+          <w:sz w:val="14"/>
+        </w:rPr>
+        <w:t xml:space="preserve">con esto sigue la sesión anterior y no pide </w:t>
+      </w:r>
+    </w:p>
+    <w:p>
+      <w:pPr>
+        <w:ind w:left="7788" w:firstLine="708"/>
+        <w:rPr>
+          <w:noProof/>
+          <w:color w:val="FF0000"/>
+        </w:rPr>
+      </w:pPr>
+      <w:r>
+        <w:rPr>
+          <w:noProof/>
+          <w:color w:val="FF0000"/>
+          <w:sz w:val="14"/>
+        </w:rPr>
+        <w:t>permiso para modificaciones</w:t>
+      </w:r>
+    </w:p>
+    <w:p>
+      <w:pPr>
+        <w:rPr>
+          <w:noProof/>
+          <w:sz w:val="14"/>
+        </w:rPr>
+      </w:pPr>
+      <w:r>
+        <w:rPr>
+          <w:noProof/>
+        </w:rPr>
+        <w:tab/>
+      </w:r>
+      <w:r>
+        <w:rPr>
+          <w:noProof/>
+        </w:rPr>
+        <w:tab/>
+      </w:r>
+      <w:r>
+        <w:rPr>
+          <w:noProof/>
+        </w:rPr>
+        <w:tab/>
+      </w:r>
+      <w:r>
+        <w:rPr>
+          <w:noProof/>
+        </w:rPr>
+        <w:tab/>
+        <w:t xml:space="preserve">agy </w:t>
+      </w:r>
+      <w:r>
+        <w:rPr>
+          <w:noProof/>
+          <w:color w:val="FF0000"/>
+        </w:rPr>
+        <w:t>**</w:t>
+      </w:r>
+      <w:r>
+        <w:rPr>
+          <w:noProof/>
+          <w:color w:val="FF0000"/>
+          <w:sz w:val="14"/>
+        </w:rPr>
+        <w:t xml:space="preserve"> abre la consola normalmente</w:t>
+      </w:r>
+    </w:p>
+    <w:p>
+      <w:pPr>
+        <w:rPr>
+          <w:noProof/>
+        </w:rPr>
+      </w:pPr>
+    </w:p>
+    <w:p>
+      <w:pPr>
+        <w:rPr>
+          <w:noProof/>
+        </w:rPr>
+      </w:pPr>
+      <w:r>
+        <w:rPr>
+          <w:noProof/>
+        </w:rPr>
+        <w:t>OPENCODE:</w:t>
+      </w:r>
+    </w:p>
+    <w:p>
+      <w:pPr>
+        <w:rPr>
+          <w:noProof/>
+        </w:rPr>
+      </w:pPr>
+      <w:r>
+        <w:rPr>
+          <w:noProof/>
+        </w:rPr>
+        <w:t>En la consola de Power Shell:</w:t>
+      </w:r>
+    </w:p>
+    <w:p>
+      <w:pPr>
+        <w:rPr>
+          <w:noProof/>
+        </w:rPr>
+      </w:pPr>
+      <w:r>
+        <w:rPr>
+          <w:noProof/>
+        </w:rPr>
+        <w:tab/>
+      </w:r>
+      <w:r>
+        <w:rPr>
+          <w:noProof/>
+        </w:rPr>
+        <w:tab/>
+      </w:r>
+      <w:r>
+        <w:rPr>
+          <w:noProof/>
+        </w:rPr>
+        <w:tab/>
+      </w:r>
+      <w:r>
+        <w:rPr>
+          <w:noProof/>
+        </w:rPr>
+        <w:tab/>
+        <w:t>opencode</w:t>
+      </w:r>
+    </w:p>
+    <w:p>
+      <w:pPr>
+        <w:ind w:left="2124" w:firstLine="708"/>
+        <w:rPr>
+          <w:noProof/>
+          <w:sz w:val="14"/>
+        </w:rPr>
+      </w:pPr>
+      <w:r>
+        <w:rPr>
+          <w:noProof/>
+        </w:rPr>
+        <w:t>opencode --continue</w:t>
+      </w:r>
+      <w:r>
+        <w:rPr>
+          <w:noProof/>
+        </w:rPr>
+        <w:t xml:space="preserve"> </w:t>
+      </w:r>
+      <w:r>
+        <w:rPr>
+          <w:noProof/>
+          <w:color w:val="FF0000"/>
+        </w:rPr>
+        <w:t>**</w:t>
+      </w:r>
+      <w:r>
+        <w:rPr>
+          <w:noProof/>
+          <w:color w:val="FF0000"/>
+          <w:sz w:val="14"/>
+        </w:rPr>
+        <w:t>con esto sigue la sesión anterior</w:t>
+      </w:r>
+    </w:p>
+    <w:p>
+      <w:pPr>
+        <w:rPr>
+          <w:noProof/>
+        </w:rPr>
+      </w:pPr>
+    </w:p>
+    <w:p>
+      <w:pPr>
+        <w:rPr>
+          <w:noProof/>
+        </w:rPr>
+      </w:pPr>
+    </w:p>
+    <w:p>
+      <w:pPr>
+        <w:rPr>
+          <w:noProof/>
+        </w:rPr>
+      </w:pPr>
+      <w:r>
+        <w:rPr>
+          <w:noProof/>
+        </w:rPr>
+        <w:t>CHAT GPT:</w:t>
+      </w:r>
+    </w:p>
+    <w:p>
+      <w:pPr>
+        <w:rPr>
+          <w:noProof/>
+        </w:rPr>
+      </w:pPr>
+      <w:r>
+        <w:rPr>
+          <w:noProof/>
+        </w:rPr>
+        <w:t>En la consola de Power Shell:</w:t>
+      </w:r>
+    </w:p>
+    <w:p>
+      <w:pPr>
+        <w:rPr>
+          <w:noProof/>
+        </w:rPr>
+      </w:pPr>
+      <w:r>
+        <w:rPr>
+          <w:noProof/>
+        </w:rPr>
+        <w:tab/>
+      </w:r>
+      <w:r>
+        <w:rPr>
+          <w:noProof/>
+        </w:rPr>
+        <w:tab/>
+      </w:r>
+      <w:r>
+        <w:rPr>
+          <w:noProof/>
+        </w:rPr>
+        <w:tab/>
+      </w:r>
+      <w:r>
+        <w:rPr>
+          <w:noProof/>
+        </w:rPr>
+        <w:tab/>
+        <w:t>codex</w:t>
+      </w:r>
+    </w:p>
+    <w:p>
+      <w:r>
+        <w:rPr>
+          <w:noProof/>
+        </w:rPr>
+        <w:tab/>
+      </w:r>
+      <w:r>
+        <w:rPr>
+          <w:noProof/>
+        </w:rPr>
+        <w:tab/>
+      </w:r>
+      <w:r>
+        <w:rPr>
+          <w:noProof/>
+        </w:rPr>
+        <w:tab/>
+      </w:r>
+      <w:r>
+        <w:rPr>
+          <w:noProof/>
+        </w:rPr>
+        <w:tab/>
+      </w:r>
+      <w:r>
+        <w:rPr>
+          <w:noProof/>
+        </w:rPr>
+        <w:t>codex</w:t>
+      </w:r>
+      <w:r>
+        <w:t xml:space="preserve"> resu</w:t>
+      </w:r>
       <w:bookmarkStart w:id="0" w:name="_GoBack"/>
       <w:bookmarkEnd w:id="0"/>
       <w:r>
-        <w:t>DOCKER:</w:t>
-      </w:r>
-    </w:p>
-    <w:p/>
-    <w:p>
-      <w:r>
-        <w:t>Tener abierto Docker desktop</w:t>
-      </w:r>
-    </w:p>
-    <w:p>
-      <w:r>
-        <w:t xml:space="preserve">En la consola de </w:t>
+        <w:t xml:space="preserve">me </w:t>
+      </w:r>
+      <w:r>
+        <w:t>–</w:t>
       </w:r>
       <w:proofErr w:type="spellStart"/>
       <w:r>
-        <w:t>Power</w:t>
+        <w:t>last</w:t>
       </w:r>
       <w:proofErr w:type="spellEnd"/>
       <w:r>
-        <w:t xml:space="preserve"> Shell:</w:t>
-      </w:r>
-    </w:p>
-    <w:p>
-      <w:r>
-        <w:tab/>
-      </w:r>
-      <w:r>
-        <w:tab/>
-      </w:r>
-      <w:r>
-        <w:tab/>
-      </w:r>
-      <w:r>
-        <w:tab/>
-        <w:t xml:space="preserve">Docker </w:t>
-      </w:r>
-      <w:proofErr w:type="spellStart"/>
-      <w:r>
-        <w:t>ai</w:t>
-      </w:r>
-      <w:proofErr w:type="spellEnd"/>
-    </w:p>
-    <w:p/>
-    <w:p>
-      <w:r>
-        <w:t>ANTIGRAVITY:</w:t>
-      </w:r>
-    </w:p>
-    <w:p>
-      <w:r>
-        <w:t xml:space="preserve">En la consola de </w:t>
-      </w:r>
-      <w:proofErr w:type="spellStart"/>
-      <w:r>
-        <w:t>Power</w:t>
-      </w:r>
-      <w:proofErr w:type="spellEnd"/>
-      <w:r>
-        <w:t xml:space="preserve"> Shell:</w:t>
-      </w:r>
-    </w:p>
-    <w:p>
-      <w:pPr>
-        <w:rPr>
+        <w:t xml:space="preserve"> </w:t>
+      </w:r>
+      <w:r>
+        <w:rPr>
+          <w:color w:val="FF0000"/>
+        </w:rPr>
+        <w:t>**</w:t>
+      </w:r>
+      <w:r>
+        <w:rPr>
+          <w:color w:val="FF0000"/>
           <w:sz w:val="14"/>
         </w:rPr>
-      </w:pPr>
-      <w:r>
-        <w:tab/>
-      </w:r>
-      <w:r>
-        <w:tab/>
-      </w:r>
-      <w:r>
-        <w:tab/>
-      </w:r>
-      <w:r>
-        <w:tab/>
-      </w:r>
-      <w:proofErr w:type="spellStart"/>
-      <w:r>
-        <w:t>agy</w:t>
-      </w:r>
-      <w:proofErr w:type="spellEnd"/>
-      <w:r>
-        <w:t xml:space="preserve"> --</w:t>
-      </w:r>
-      <w:proofErr w:type="spellStart"/>
-      <w:r>
-        <w:t>continue</w:t>
-      </w:r>
-      <w:proofErr w:type="spellEnd"/>
-      <w:r>
-        <w:t xml:space="preserve"> --</w:t>
-      </w:r>
-      <w:proofErr w:type="spellStart"/>
-      <w:r>
-        <w:t>dangerously-skip-permissions</w:t>
-      </w:r>
-      <w:proofErr w:type="spellEnd"/>
-      <w:r>
-        <w:t xml:space="preserve"> **</w:t>
-      </w:r>
-      <w:r>
-        <w:rPr>
-          <w:sz w:val="14"/>
-        </w:rPr>
-        <w:t xml:space="preserve">con esto sigue la sesión anterior y no pide </w:t>
-      </w:r>
-    </w:p>
-    <w:p>
-      <w:pPr>
-        <w:ind w:left="7788" w:firstLine="708"/>
-      </w:pPr>
-      <w:r>
-        <w:rPr>
-          <w:sz w:val="14"/>
-        </w:rPr>
-        <w:t>permiso para modificaciones</w:t>
-      </w:r>
-    </w:p>
-    <w:p>
-      <w:pPr>
-        <w:rPr>
-          <w:sz w:val="14"/>
-        </w:rPr>
-      </w:pPr>
-      <w:r>
-        <w:tab/>
-      </w:r>
-      <w:r>
-        <w:tab/>
-      </w:r>
-      <w:r>
-        <w:tab/>
-      </w:r>
-      <w:r>
-        <w:tab/>
-      </w:r>
-      <w:proofErr w:type="spellStart"/>
-      <w:r>
-        <w:t>agy</w:t>
-      </w:r>
-      <w:proofErr w:type="spellEnd"/>
-      <w:r>
-        <w:t xml:space="preserve"> **</w:t>
-      </w:r>
-      <w:r>
-        <w:rPr>
-          <w:sz w:val="14"/>
-        </w:rPr>
-        <w:t xml:space="preserve"> </w:t>
-      </w:r>
-      <w:r>
-        <w:rPr>
-          <w:sz w:val="14"/>
-        </w:rPr>
-        <w:t>abre la consola normalmente</w:t>
-      </w:r>
-    </w:p>
-    <w:p/>
-    <w:p>
-      <w:r>
-        <w:t>OPENCODE:</w:t>
-      </w:r>
-    </w:p>
-    <w:p>
-      <w:r>
-        <w:t xml:space="preserve">En la consola de </w:t>
-      </w:r>
-      <w:proofErr w:type="spellStart"/>
-      <w:r>
-        <w:t>Power</w:t>
-      </w:r>
-      <w:proofErr w:type="spellEnd"/>
-      <w:r>
-        <w:t xml:space="preserve"> Shell:</w:t>
-      </w:r>
-    </w:p>
-    <w:p>
-      <w:r>
-        <w:tab/>
-      </w:r>
-      <w:r>
-        <w:tab/>
-      </w:r>
-      <w:r>
-        <w:tab/>
-      </w:r>
-      <w:r>
-        <w:tab/>
-      </w:r>
-      <w:proofErr w:type="spellStart"/>
-      <w:r>
-        <w:t>opencode</w:t>
-      </w:r>
-      <w:proofErr w:type="spellEnd"/>
-    </w:p>
-    <w:p>
-      <w:pPr>
-        <w:ind w:left="2124" w:firstLine="708"/>
-        <w:rPr>
-          <w:sz w:val="14"/>
-        </w:rPr>
-      </w:pPr>
-      <w:proofErr w:type="spellStart"/>
-      <w:r>
-        <w:t>opencode</w:t>
-      </w:r>
-      <w:proofErr w:type="spellEnd"/>
-      <w:r>
-        <w:t xml:space="preserve"> --</w:t>
-      </w:r>
-      <w:proofErr w:type="spellStart"/>
-      <w:r>
-        <w:t>continue</w:t>
-      </w:r>
-      <w:proofErr w:type="spellEnd"/>
-      <w:r>
-        <w:t xml:space="preserve"> **</w:t>
-      </w:r>
-      <w:r>
-        <w:rPr>
-          <w:sz w:val="14"/>
-        </w:rPr>
         <w:t>con esto sigue la sesión anterior</w:t>
       </w:r>
     </w:p>
-    <w:p/>
-    <w:p/>
-    <w:p/>
     <w:sectPr>
       <w:pgSz w:w="12240" w:h="15840"/>
       <w:pgMar w:top="142" w:right="191" w:bottom="142" w:left="142" w:header="709" w:footer="709" w:gutter="0"/>

</xml_diff>